<commit_message>
Enhance StudentGradeManagerApp short-circuit logic and refine report Section 9 architectural walkthrough
</commit_message>
<xml_diff>
--- a/Task1_Java_Syntax_and_Basic_Operations.docx
+++ b/Task1_Java_Syntax_and_Basic_Operations.docx
@@ -6071,7 +6071,168 @@
           <w:color w:val="2E5B88"/>
           <w:sz w:val="28"/>
         </w:rPr>
-        <w:t>9.1 Code Implementation (StudentGradeManagerApp.java)</w:t>
+        <w:t>9.1 Architectural Design &amp; Step-by-Step Code Walkthrough</w:t>
+      </w:r>
+    </w:p>
+    <w:p>
+      <w:r>
+        <w:t>The architecture of StudentGradeManagerApp.java was engineered to serve as a comprehensive capstone demonstrating enterprise software engineering patterns within a single executable program. Below is a detailed walkthrough of each architectural component:</w:t>
+      </w:r>
+    </w:p>
+    <w:p>
+      <w:r>
+        <w:rPr>
+          <w:b/>
+          <w:color w:val="1B365D"/>
+        </w:rPr>
+        <w:t>1. Multidimensional Matrix &amp; Parallel Arrays Layout:</w:t>
+        <w:br/>
+      </w:r>
+      <w:r>
+        <w:t>In Java, multi-dimensional arrays are implemented as arrays-of-arrays stored in Heap memory. The 2D matrix rawMarks[4][4] consists of an outer array of 4 reference pointers, each pointing to an independent 4-element integer array storing scores across four curriculum modules (Java Core, Algorithms, Database SQL, Web Basics). Parallel 1D arrays (studentNames, studentAttendance, hasDisciplinaryWarning) are structurally synchronized by shared index i (0 to 3), enabling O(1) relational access across student dimensions.</w:t>
+      </w:r>
+    </w:p>
+    <w:p>
+      <w:r>
+        <w:rPr>
+          <w:b/>
+          <w:color w:val="1B365D"/>
+        </w:rPr>
+        <w:t>2. Data Integrity Architecture &amp; validateAllMarks() Method:</w:t>
+        <w:br/>
+      </w:r>
+      <w:r>
+        <w:t>Enterprise applications must prevent corrupted or fraudulent data from propagating into business calculations. A checked exception InvalidMarkException is defined with an internal field invalidMark and a getter getInvalidMark(). The static helper method validateAllMarks(int[][] matrix) traverses every row and column. If any score violates the invariant [0 &lt;= mark &lt;= 100], it immediately instantiates and throws InvalidMarkException. The main method encloses this validation within a try-catch-finally block, halting execution on error while guaranteeing audit trail completion in the finally block.</w:t>
+      </w:r>
+    </w:p>
+    <w:p>
+      <w:r>
+        <w:rPr>
+          <w:b/>
+          <w:color w:val="1B365D"/>
+        </w:rPr>
+        <w:t>3. High-Precision Calculations &amp; Widening Type Casting:</w:t>
+        <w:br/>
+      </w:r>
+      <w:r>
+        <w:t>When dividing integers in Java, the '/' operator performs integer truncation, discarding remainder fractions (e.g., 355 / 4 = 88 instead of 88.75). The calculation logic applies an explicit widening cast '(double) studentTotal / subjectCount', coercing the numerator to a 64-bit IEEE 754 floating-point representation before division occurs. This ensures exact, fractional grade determination and precision class-wide averages.</w:t>
+      </w:r>
+    </w:p>
+    <w:p>
+      <w:r>
+        <w:rPr>
+          <w:b/>
+          <w:color w:val="1B365D"/>
+        </w:rPr>
+        <w:t>4. Short-Circuit Logic for Scholarship Eligibility:</w:t>
+        <w:br/>
+      </w:r>
+      <w:r>
+        <w:t>Candidate scholarship qualification requires multi-factor clearance. The program evaluates the composite boolean expression:</w:t>
+        <w:br/>
+        <w:t xml:space="preserve">   isScholarshipAwarded = ((studentAttendance[i] &gt;= 85 &amp;&amp; average &gt;= 85.0) &amp;&amp; !hasDisciplinaryWarning[i]);</w:t>
+        <w:br/>
+        <w:t>Java's short-circuit '&amp;&amp;' operator guarantees that if attendance is below 85%, the score comparison is bypassed entirely, reducing superfluous computation. The logical NOT operator '!' cleanly enforces zero-tolerance disciplinary standing.</w:t>
+      </w:r>
+    </w:p>
+    <w:p>
+      <w:r>
+        <w:rPr>
+          <w:b/>
+          <w:color w:val="1B365D"/>
+        </w:rPr>
+        <w:t>5. Multi-Loop Iteration Workflows:</w:t>
+        <w:br/>
+      </w:r>
+      <w:r>
+        <w:t>The program incorporates four distinct loop variations, each matched to its optimal real-world enterprise scenario:</w:t>
+        <w:br/>
+        <w:t>• Nested for loops: Outer loop iterates through each student; inner loop sums across subject columns.</w:t>
+        <w:br/>
+        <w:t>• while loop: An entry-controlled loop simulating batch generation of student report cards, advancing a report counter until all 4 cards are dispatched.</w:t>
+        <w:br/>
+        <w:t>• do-while loop: An exit-controlled loop simulating automated database cache synchronization. It guarantees at least one execution attempt, polling until sync succeeds or maximum retries are reached.</w:t>
+        <w:br/>
+        <w:t>• Enhanced for-each loop: A clean, index-free loop iterating over the subjects array for auditing curriculum modules.</w:t>
+      </w:r>
+    </w:p>
+    <w:p>
+      <w:r>
+        <w:rPr>
+          <w:b/>
+          <w:color w:val="1B365D"/>
+        </w:rPr>
+        <w:t>6. Career Advisory Routing (Switch Statement) &amp; Tabular Formatted Output:</w:t>
+        <w:br/>
+      </w:r>
+      <w:r>
+        <w:t>The program determines the top performer across the cohort and executes an administrative switch statement routing the student to specialized development tracks (e.g., Grade A routes to Advanced R&amp;D, Grade B to Industry Certification). Finally, results are rendered via System.out.printf() with strict column alignment format specifiers (%-4s, %-15s, %-8.2f) for production-grade readability.</w:t>
+      </w:r>
+    </w:p>
+    <w:tbl>
+      <w:tblPr>
+        <w:tblW w:type="auto" w:w="0"/>
+        <w:jc w:val="center"/>
+        <w:tblLayout w:type="fixed"/>
+        <w:tblLook w:firstColumn="1" w:firstRow="1" w:lastColumn="0" w:lastRow="0" w:noHBand="0" w:noVBand="1" w:val="04A0"/>
+      </w:tblPr>
+      <w:tblGrid>
+        <w:gridCol w:w="9360"/>
+      </w:tblGrid>
+      <w:tr>
+        <w:tc>
+          <w:tcPr>
+            <w:tcW w:type="dxa" w:w="9360"/>
+            <w:shd w:fill="EFF6FF"/>
+            <w:tcMar>
+              <w:top w:w="140" w:type="dxa"/>
+              <w:bottom w:w="140" w:type="dxa"/>
+              <w:left w:w="200" w:type="dxa"/>
+              <w:right w:w="200" w:type="dxa"/>
+            </w:tcMar>
+            <w:tcBorders>
+              <w:left w:val="single" w:sz="24" w:space="0" w:color="2563EB"/>
+              <w:top w:val="none"/>
+              <w:right w:val="none"/>
+              <w:bottom w:val="none"/>
+            </w:tcBorders>
+          </w:tcPr>
+          <w:p>
+            <w:pPr>
+              <w:spacing w:line="276" w:lineRule="auto" w:after="40"/>
+            </w:pPr>
+            <w:r>
+              <w:rPr>
+                <w:b/>
+                <w:color w:val="2563EB"/>
+                <w:sz w:val="20"/>
+              </w:rPr>
+              <w:t xml:space="preserve">[SOFTWARE DESIGN PRINCIPLE] </w:t>
+            </w:r>
+            <w:r>
+              <w:rPr>
+                <w:color w:val="1E293B"/>
+                <w:sz w:val="21"/>
+              </w:rPr>
+              <w:t>Architectural Insight: By enforcing data validation upfront via validateAllMarks() before entering computation loops, the application strictly satisfies the Fail-Fast Principle, preventing corrupted state and inconsistent database writes.</w:t>
+            </w:r>
+          </w:p>
+        </w:tc>
+      </w:tr>
+    </w:tbl>
+    <w:p/>
+    <w:p>
+      <w:pPr>
+        <w:spacing w:before="240" w:after="120"/>
+      </w:pPr>
+      <w:r>
+        <w:rPr>
+          <w:rFonts w:ascii="Calibri" w:hAnsi="Calibri"/>
+          <w:b/>
+          <w:color w:val="2E5B88"/>
+          <w:sz w:val="28"/>
+        </w:rPr>
+        <w:t>9.2 Complete Source Code (StudentGradeManagerApp.java)</w:t>
       </w:r>
     </w:p>
     <w:tbl>
@@ -6344,16 +6505,11 @@
               <w:t xml:space="preserve">            String academicStatus = (average &gt;= PASS_MARK_THRESHOLD) ? "PASSED" : "FAILED";</w:t>
               <w:br/>
               <w:br/>
-              <w:t xml:space="preserve">            // Topic 2 &amp; 3: Logical Operators &amp; Nested if for Scholarship Eligibility</w:t>
-              <w:br/>
-              <w:t xml:space="preserve">            boolean attendanceEligible = (studentAttendance[i] &gt;= 85);</w:t>
-              <w:br/>
-              <w:t xml:space="preserve">            boolean scoreEligible = (average &gt;= 85.0);</w:t>
-              <w:br/>
-              <w:t xml:space="preserve">            boolean disciplineClean = !hasDisciplinaryWarning[i];</w:t>
-              <w:br/>
-              <w:br/>
-              <w:t xml:space="preserve">            boolean isScholarshipAwarded = (attendanceEligible &amp;&amp; scoreEligible) &amp;&amp; disciplineClean;</w:t>
+              <w:t xml:space="preserve">            // Topic 2 &amp; 3: Composite short-circuit boolean logic for Scholarship Eligibility</w:t>
+              <w:br/>
+              <w:t xml:space="preserve">            // Explicit rule: ((attendance &gt;= 85 &amp;&amp; average &gt;= 85.0) &amp;&amp; !disciplinaryWarning)</w:t>
+              <w:br/>
+              <w:t xml:space="preserve">            boolean isScholarshipAwarded = ((studentAttendance[i] &gt;= 85 &amp;&amp; average &gt;= 85.0) &amp;&amp; !hasDisciplinaryWarning[i]);</w:t>
               <w:br/>
               <w:t xml:space="preserve">            String scholarshipStatus = isScholarshipAwarded ? "ELIGIBLE (50%)" : "NOT ELIGIBLE";</w:t>
               <w:br/>
@@ -6541,7 +6697,7 @@
           <w:color w:val="2E5B88"/>
           <w:sz w:val="28"/>
         </w:rPr>
-        <w:t>9.2 Verified Terminal Output</w:t>
+        <w:t>9.3 Verified Terminal Output</w:t>
       </w:r>
     </w:p>
     <w:tbl>

</xml_diff>